<commit_message>
git-ignore file and notes
</commit_message>
<xml_diff>
--- a/lecture_2/Git_GitHub_Complete_Guide.docx
+++ b/lecture_2/Git_GitHub_Complete_Guide.docx
@@ -2151,13 +2151,7 @@
         <w:rPr>
           <w:rFonts w:ascii="Sitka Small" w:hAnsi="Sitka Small"/>
         </w:rPr>
-        <w:t xml:space="preserve">$ </w:t>
-      </w:r>
-      <w:r>
-        <w:rPr>
-          <w:rFonts w:ascii="Sitka Small" w:hAnsi="Sitka Small"/>
-        </w:rPr>
-        <w:t>git remote -v</w:t>
+        <w:t>$ git remote -v</w:t>
       </w:r>
     </w:p>
     <w:p>
@@ -2416,6 +2410,114 @@
     </w:p>
     <w:p>
       <w:pPr>
+        <w:spacing w:after="240"/>
+        <w:rPr>
+          <w:rFonts w:ascii="Sitka Small" w:hAnsi="Sitka Small"/>
+        </w:rPr>
+      </w:pPr>
+      <w:r>
+        <w:rPr>
+          <w:rFonts w:ascii="Sitka Small" w:hAnsi="Sitka Small"/>
+        </w:rPr>
+        <w:lastRenderedPageBreak/>
+        <w:t>To un</w:t>
+      </w:r>
+      <w:r>
+        <w:rPr>
+          <w:rFonts w:ascii="Sitka Small" w:hAnsi="Sitka Small"/>
+        </w:rPr>
+        <w:t>-</w:t>
+      </w:r>
+      <w:r>
+        <w:rPr>
+          <w:rFonts w:ascii="Sitka Small" w:hAnsi="Sitka Small"/>
+        </w:rPr>
+        <w:t xml:space="preserve">stage your changes </w:t>
+      </w:r>
+      <w:r>
+        <w:rPr>
+          <w:rFonts w:ascii="Sitka Small" w:hAnsi="Sitka Small"/>
+        </w:rPr>
+        <w:t>:</w:t>
+      </w:r>
+    </w:p>
+    <w:tbl>
+      <w:tblPr>
+        <w:tblW w:w="9000" w:type="dxa"/>
+        <w:tblBorders>
+          <w:top w:val="single" w:sz="4" w:space="0" w:color="auto"/>
+          <w:left w:val="single" w:sz="4" w:space="0" w:color="auto"/>
+          <w:bottom w:val="single" w:sz="4" w:space="0" w:color="auto"/>
+          <w:right w:val="single" w:sz="4" w:space="0" w:color="auto"/>
+          <w:insideH w:val="single" w:sz="4" w:space="0" w:color="auto"/>
+          <w:insideV w:val="single" w:sz="4" w:space="0" w:color="auto"/>
+        </w:tblBorders>
+        <w:tblCellMar>
+          <w:left w:w="10" w:type="dxa"/>
+          <w:right w:w="10" w:type="dxa"/>
+        </w:tblCellMar>
+        <w:tblLook w:val="04A0" w:firstRow="1" w:lastRow="0" w:firstColumn="1" w:lastColumn="0" w:noHBand="0" w:noVBand="1"/>
+      </w:tblPr>
+      <w:tblGrid>
+        <w:gridCol w:w="9000"/>
+      </w:tblGrid>
+      <w:tr>
+        <w:tc>
+          <w:tcPr>
+            <w:tcW w:w="9000" w:type="dxa"/>
+            <w:tcBorders>
+              <w:top w:val="single" w:sz="2" w:space="0" w:color="CCCCCC"/>
+              <w:left w:val="single" w:sz="2" w:space="0" w:color="CCCCCC"/>
+              <w:bottom w:val="single" w:sz="2" w:space="0" w:color="CCCCCC"/>
+              <w:right w:val="single" w:sz="2" w:space="0" w:color="CCCCCC"/>
+            </w:tcBorders>
+            <w:shd w:val="clear" w:color="auto" w:fill="1E1E1E"/>
+            <w:tcMar>
+              <w:top w:w="160" w:type="dxa"/>
+              <w:left w:w="240" w:type="dxa"/>
+              <w:bottom w:w="160" w:type="dxa"/>
+              <w:right w:w="240" w:type="dxa"/>
+            </w:tcMar>
+            <w:hideMark/>
+          </w:tcPr>
+          <w:p>
+            <w:pPr>
+              <w:rPr>
+                <w:rFonts w:ascii="Sitka Small" w:hAnsi="Sitka Small"/>
+                <w:sz w:val="24"/>
+                <w:szCs w:val="24"/>
+              </w:rPr>
+            </w:pPr>
+            <w:r>
+              <w:rPr>
+                <w:rFonts w:ascii="Sitka Small" w:eastAsia="Courier New" w:hAnsi="Sitka Small" w:cs="Courier New"/>
+                <w:sz w:val="24"/>
+                <w:szCs w:val="24"/>
+              </w:rPr>
+              <w:t xml:space="preserve">$ </w:t>
+            </w:r>
+            <w:r>
+              <w:rPr>
+                <w:rFonts w:ascii="Sitka Small" w:eastAsia="Courier New" w:hAnsi="Sitka Small" w:cs="Courier New"/>
+                <w:sz w:val="24"/>
+                <w:szCs w:val="24"/>
+              </w:rPr>
+              <w:t>git restore --staged .</w:t>
+            </w:r>
+          </w:p>
+        </w:tc>
+      </w:tr>
+    </w:tbl>
+    <w:p>
+      <w:pPr>
+        <w:spacing w:after="240"/>
+        <w:rPr>
+          <w:rFonts w:ascii="Sitka Small" w:hAnsi="Sitka Small"/>
+        </w:rPr>
+      </w:pPr>
+    </w:p>
+    <w:p>
+      <w:pPr>
         <w:pStyle w:val="Heading2"/>
         <w:rPr>
           <w:rFonts w:ascii="Sitka Small" w:hAnsi="Sitka Small"/>
@@ -2426,7 +2528,6 @@
           <w:rFonts w:ascii="Sitka Small" w:hAnsi="Sitka Small"/>
           <w:color w:val="2E75B6"/>
         </w:rPr>
-        <w:lastRenderedPageBreak/>
         <w:t>Step 5 — Commit Your Files</w:t>
       </w:r>
     </w:p>
@@ -3118,7 +3219,6 @@
         <w:rPr>
           <w:rFonts w:ascii="Sitka Small" w:hAnsi="Sitka Small"/>
         </w:rPr>
-        <w:lastRenderedPageBreak/>
         <w:t>(fetch) = the path used when DOWNLOADING from GitHub</w:t>
       </w:r>
     </w:p>
@@ -3669,7 +3769,6 @@
           <w:sz w:val="24"/>
           <w:szCs w:val="24"/>
         </w:rPr>
-        <w:lastRenderedPageBreak/>
         <w:t>Cause:</w:t>
       </w:r>
     </w:p>
@@ -4235,6 +4334,7 @@
           <w:sz w:val="24"/>
           <w:szCs w:val="24"/>
         </w:rPr>
+        <w:lastRenderedPageBreak/>
         <w:t>Fix — Generate a Personal Access Token:</w:t>
       </w:r>
     </w:p>
@@ -4366,7 +4466,6 @@
         <w:rPr>
           <w:rFonts w:ascii="Sitka Small" w:hAnsi="Sitka Small"/>
         </w:rPr>
-        <w:lastRenderedPageBreak/>
         <w:t>Click Generate token and COPY it immediately</w:t>
       </w:r>
     </w:p>
@@ -5102,6 +5201,7 @@
                 <w:sz w:val="18"/>
                 <w:szCs w:val="18"/>
               </w:rPr>
+              <w:lastRenderedPageBreak/>
               <w:t>git remote add origin &lt;</w:t>
             </w:r>
             <w:proofErr w:type="spellStart"/>
@@ -5438,7 +5538,6 @@
                 <w:sz w:val="18"/>
                 <w:szCs w:val="18"/>
               </w:rPr>
-              <w:lastRenderedPageBreak/>
               <w:t>git add .</w:t>
             </w:r>
           </w:p>
@@ -6313,6 +6412,7 @@
                 <w:sz w:val="20"/>
                 <w:szCs w:val="20"/>
               </w:rPr>
+              <w:lastRenderedPageBreak/>
               <w:t>git push -u origin main</w:t>
             </w:r>
           </w:p>
@@ -6531,6 +6631,7 @@
       <w:r>
         <w:rPr>
           <w:rFonts w:ascii="Sitka Small" w:hAnsi="Sitka Small"/>
+          <w:noProof/>
         </w:rPr>
         <w:drawing>
           <wp:inline distT="0" distB="0" distL="0" distR="0" wp14:anchorId="14F0E026" wp14:editId="5AF57F4F">
@@ -6587,6 +6688,7 @@
       <w:r>
         <w:rPr>
           <w:rFonts w:ascii="Sitka Small" w:hAnsi="Sitka Small"/>
+          <w:noProof/>
         </w:rPr>
         <w:drawing>
           <wp:inline distT="0" distB="0" distL="0" distR="0" wp14:anchorId="35C743B4" wp14:editId="2D636479">
@@ -6643,6 +6745,7 @@
       <w:r>
         <w:rPr>
           <w:rFonts w:ascii="Sitka Small" w:hAnsi="Sitka Small"/>
+          <w:noProof/>
         </w:rPr>
         <w:drawing>
           <wp:inline distT="0" distB="0" distL="0" distR="0" wp14:anchorId="05A844E6" wp14:editId="24A4473A">
@@ -6699,7 +6802,9 @@
       <w:r>
         <w:rPr>
           <w:rFonts w:ascii="Sitka Small" w:hAnsi="Sitka Small"/>
-        </w:rPr>
+          <w:noProof/>
+        </w:rPr>
+        <w:lastRenderedPageBreak/>
         <w:drawing>
           <wp:inline distT="0" distB="0" distL="0" distR="0" wp14:anchorId="5B8FB738" wp14:editId="063C3AF2">
             <wp:extent cx="5943600" cy="1938020"/>
@@ -6755,6 +6860,7 @@
       <w:r>
         <w:rPr>
           <w:rFonts w:ascii="Sitka Small" w:hAnsi="Sitka Small"/>
+          <w:noProof/>
         </w:rPr>
         <w:drawing>
           <wp:inline distT="0" distB="0" distL="0" distR="0" wp14:anchorId="10C91B71" wp14:editId="3B8315E8">
@@ -6811,6 +6917,7 @@
       <w:r>
         <w:rPr>
           <w:rFonts w:ascii="Sitka Small" w:hAnsi="Sitka Small"/>
+          <w:noProof/>
         </w:rPr>
         <w:drawing>
           <wp:inline distT="0" distB="0" distL="0" distR="0" wp14:anchorId="4E603750" wp14:editId="2322F24B">
@@ -6867,7 +6974,9 @@
       <w:r>
         <w:rPr>
           <w:rFonts w:ascii="Sitka Small" w:hAnsi="Sitka Small"/>
-        </w:rPr>
+          <w:noProof/>
+        </w:rPr>
+        <w:lastRenderedPageBreak/>
         <w:drawing>
           <wp:inline distT="0" distB="0" distL="0" distR="0" wp14:anchorId="3BC2D297" wp14:editId="783895B7">
             <wp:extent cx="5943600" cy="2124075"/>
@@ -6923,8 +7032,8 @@
       <w:r>
         <w:rPr>
           <w:rFonts w:ascii="Sitka Small" w:hAnsi="Sitka Small"/>
-        </w:rPr>
-        <w:lastRenderedPageBreak/>
+          <w:noProof/>
+        </w:rPr>
         <w:drawing>
           <wp:inline distT="0" distB="0" distL="0" distR="0" wp14:anchorId="0361ABB0" wp14:editId="3D6975BD">
             <wp:extent cx="5943600" cy="3196590"/>

</xml_diff>